<commit_message>
Paper: item #23 -- real tuck-then-deploy figure from a captured self-righting event
Fifth capture attempt (longer camera-track convergence wait) finally got a
clean, well-framed close-up: scout_2 mid-righting-roll with one leg
visibly tucked against the body while the other two remain extended --
directly illustrates the tuck-then-deploy mechanism in §3.3, and is real
sim telemetry (not staged), corroborated by the dashboard's non-zero,
asymmetric leg-angle readout at capture time.

Inserted as new Figure 7, renumbering 7-16 to 8-17 (18 total). Also fixed
a real bug in prep_docx_md.py: the mermaid-diagram PNG lookup table was
keyed to pre-renumbering figure IDs, silently dropping two diagrams and
inserting the wrong one (search-flowchart image under the auction-
sequence caption) in the previous docx build.

Item #28 (landed close-up) still open -- this run raced landed vs
righting and righting fired first again.
</commit_message>
<xml_diff>
--- a/docs/word/spacehopper_word.docx
+++ b/docs/word/spacehopper_word.docx
@@ -2,7 +2,7 @@
 <file path=word/document.xml><?xml version="1.0" encoding="utf-8"?>
 <w:document xmlns:w="http://schemas.openxmlformats.org/wordprocessingml/2006/main" xmlns:m="http://schemas.openxmlformats.org/officeDocument/2006/math" xmlns:r="http://schemas.openxmlformats.org/officeDocument/2006/relationships" xmlns:o="urn:schemas-microsoft-com:office:office" xmlns:v="urn:schemas-microsoft-com:vml" xmlns:w10="urn:schemas-microsoft-com:office:word" xmlns:a="http://schemas.openxmlformats.org/drawingml/2006/main" xmlns:pic="http://schemas.openxmlformats.org/drawingml/2006/picture" xmlns:wp="http://schemas.openxmlformats.org/drawingml/2006/wordprocessingDrawing">
   <w:body>
-    <w:bookmarkStart w:id="95" w:name="X517b4d4efe960c9a60d6afb48cba2e54859ea29"/>
+    <w:bookmarkStart w:id="98" w:name="X517b4d4efe960c9a60d6afb48cba2e54859ea29"/>
     <w:p>
       <w:pPr>
         <w:pStyle w:val="Heading1"/>
@@ -543,7 +543,7 @@
     </w:p>
     <w:bookmarkEnd w:id="32"/>
     <w:bookmarkEnd w:id="33"/>
-    <w:bookmarkStart w:id="62" w:name="system-design"/>
+    <w:bookmarkStart w:id="65" w:name="system-design"/>
     <w:p>
       <w:pPr>
         <w:pStyle w:val="Heading2"/>
@@ -5684,7 +5684,7 @@
       </w:r>
     </w:p>
     <w:bookmarkEnd w:id="46"/>
-    <w:bookmarkStart w:id="47" w:name="self-righting"/>
+    <w:bookmarkStart w:id="50" w:name="self-righting"/>
     <w:p>
       <w:pPr>
         <w:pStyle w:val="Heading3"/>
@@ -6077,16 +6077,91 @@
         <w:pStyle w:val="FirstParagraph"/>
       </w:pPr>
       <w:r>
-        <w:t xml:space="preserve">Net wheel momentum returns to approximately zero at completion, so the handoff back to attitude control imparts no kick, and during any righting maneuver an explicit arbitration flag silences the attitude controller (two nodes commanding one wheel is a silent last-write-wins conflict, §8). Measured reliability is tilt-dependent and is reported honestly in §7: the redesign eliminated the dominant on-side stall, and the mild-to-moderate tilts typical of an actual milli-gravity landing recover reliably; a body forced to a</w:t>
-      </w:r>
-      <w:r>
-        <w:t xml:space="preserve"> </w:t>
-      </w:r>
+        <w:t xml:space="preserve">Fig. 7 captures this tucked transition live, mid-roll during a real righting maneuver.</w:t>
+      </w:r>
+    </w:p>
+    <w:p>
+      <w:pPr>
+        <w:pStyle w:val="CaptionedFigure"/>
+      </w:pPr>
+      <w:r>
+        <w:drawing>
+          <wp:inline>
+            <wp:extent cx="5334000" cy="4239846"/>
+            <wp:effectExtent b="0" l="0" r="0" t="0"/>
+            <wp:docPr descr="Tuck-then-deploy leg posture during self-righting" title="" id="48" name="Picture"/>
+            <a:graphic>
+              <a:graphicData uri="http://schemas.openxmlformats.org/drawingml/2006/picture">
+                <pic:pic>
+                  <pic:nvPicPr>
+                    <pic:cNvPr descr="fig_tuck_deploy.png" id="49" name="Picture"/>
+                    <pic:cNvPicPr>
+                      <a:picLocks noChangeArrowheads="1" noChangeAspect="1"/>
+                    </pic:cNvPicPr>
+                  </pic:nvPicPr>
+                  <pic:blipFill>
+                    <a:blip r:embed="rId47"/>
+                    <a:stretch>
+                      <a:fillRect/>
+                    </a:stretch>
+                  </pic:blipFill>
+                  <pic:spPr bwMode="auto">
+                    <a:xfrm>
+                      <a:off x="0" y="0"/>
+                      <a:ext cx="5334000" cy="4239846"/>
+                    </a:xfrm>
+                    <a:prstGeom prst="rect">
+                      <a:avLst/>
+                    </a:prstGeom>
+                    <a:noFill/>
+                    <a:ln w="9525">
+                      <a:noFill/>
+                      <a:headEnd/>
+                      <a:tailEnd/>
+                    </a:ln>
+                  </pic:spPr>
+                </pic:pic>
+              </a:graphicData>
+            </a:graphic>
+          </wp:inline>
+        </w:drawing>
+      </w:r>
+    </w:p>
+    <w:p>
+      <w:pPr>
+        <w:pStyle w:val="ImageCaption"/>
+      </w:pPr>
+      <w:r>
+        <w:t xml:space="preserve">Tuck-then-deploy leg posture during self-righting</w:t>
+      </w:r>
+    </w:p>
+    <w:p>
+      <w:pPr>
+        <w:pStyle w:val="BodyText"/>
+      </w:pPr>
       <w:r>
         <w:rPr>
           <w:iCs/>
           <w:i/>
         </w:rPr>
+        <w:t xml:space="preserve">Figure 7: A scout mid-righting-roll: one leg tucked compact against the body while the other two remain extended — the transitional posture between the tucked (cylinder-roll) and re-deployed (upright-capture) phases described above.</w:t>
+      </w:r>
+    </w:p>
+    <w:p>
+      <w:pPr>
+        <w:pStyle w:val="BodyText"/>
+      </w:pPr>
+      <w:r>
+        <w:t xml:space="preserve">Net wheel momentum returns to approximately zero at completion, so the handoff back to attitude control imparts no kick, and during any righting maneuver an explicit arbitration flag silences the attitude controller (two nodes commanding one wheel is a silent last-write-wins conflict, §8). Measured reliability is tilt-dependent and is reported honestly in §7: the redesign eliminated the dominant on-side stall, and the mild-to-moderate tilts typical of an actual milli-gravity landing recover reliably; a body forced to a</w:t>
+      </w:r>
+      <w:r>
+        <w:t xml:space="preserve"> </w:t>
+      </w:r>
+      <w:r>
+        <w:rPr>
+          <w:iCs/>
+          <w:i/>
+        </w:rPr>
         <w:t xml:space="preserve">perfect</w:t>
       </w:r>
       <w:r>
@@ -6104,8 +6179,8 @@
         <w:t xml:space="preserve">An earlier self-righting strategy used the legs themselves, not the reaction wheels, to lever the body upright: alternating phases of splaying the tripod and sweeping one leg pushed against the regolith to roll the chassis, similar to a person pushing an arm against the floor to sit up. This depended on the leg segments making extended, gripping contact with the terrain along their length. It was retired for two compounding reasons: first, when the leg collision geometry was later simplified to point-like foot spheres (needed elsewhere in the model), the legs lost any extended contact surface to push through, only a point contact remained; second, the joint damping introduced in §3.4 to eliminate landing-impact energy pumping also damped the fast sweep motion this strategy relied on. With its ground leverage gone and its sweep speed suppressed, the mechanism no longer had a physical basis to work, and self-righting was moved entirely to the reaction-wheel maneuver described above.</w:t>
       </w:r>
     </w:p>
-    <w:bookmarkEnd w:id="47"/>
-    <w:bookmarkStart w:id="61" w:name="landing-detection-and-ground-handling"/>
+    <w:bookmarkEnd w:id="50"/>
+    <w:bookmarkStart w:id="64" w:name="landing-detection-and-ground-handling"/>
     <w:p>
       <w:pPr>
         <w:pStyle w:val="Heading3"/>
@@ -6403,7 +6478,7 @@
         <w:pStyle w:val="FirstParagraph"/>
       </w:pPr>
       <w:r>
-        <w:t xml:space="preserve">Fig. 7 sketches these bands schematically against a representative hop.</w:t>
+        <w:t xml:space="preserve">Fig. 8 sketches these bands schematically against a representative hop.</w:t>
       </w:r>
     </w:p>
     <w:p>
@@ -6415,18 +6490,18 @@
           <wp:inline>
             <wp:extent cx="5334000" cy="4327649"/>
             <wp:effectExtent b="0" l="0" r="0" t="0"/>
-            <wp:docPr descr="Landing-detector bands schematic" title="" id="49" name="Picture"/>
+            <wp:docPr descr="Landing-detector bands schematic" title="" id="52" name="Picture"/>
             <a:graphic>
               <a:graphicData uri="http://schemas.openxmlformats.org/drawingml/2006/picture">
                 <pic:pic>
                   <pic:nvPicPr>
-                    <pic:cNvPr descr="landing_detector_bands_sketch.png" id="50" name="Picture"/>
+                    <pic:cNvPr descr="landing_detector_bands_sketch.png" id="53" name="Picture"/>
                     <pic:cNvPicPr>
                       <a:picLocks noChangeArrowheads="1" noChangeAspect="1"/>
                     </pic:cNvPicPr>
                   </pic:nvPicPr>
                   <pic:blipFill>
-                    <a:blip r:embed="rId48"/>
+                    <a:blip r:embed="rId51"/>
                     <a:stretch>
                       <a:fillRect/>
                     </a:stretch>
@@ -6470,7 +6545,7 @@
           <w:iCs/>
           <w:i/>
         </w:rPr>
-        <w:t xml:space="preserve">Figure 7: Landing-detector bands referenced above — the contact-spike acceleration threshold and the apex-dwell/rest-window altitude bands (schematic, not measured telemetry).</w:t>
+        <w:t xml:space="preserve">Figure 8: Landing-detector bands referenced above — the contact-spike acceleration threshold and the apex-dwell/rest-window altitude bands (schematic, not measured telemetry).</w:t>
       </w:r>
     </w:p>
     <w:p>
@@ -6478,7 +6553,7 @@
         <w:pStyle w:val="BodyText"/>
       </w:pPr>
       <w:r>
-        <w:t xml:space="preserve">Fig. 8 shows a scout during final descent over this terrain, moments before the detector above must confirm touchdown.</w:t>
+        <w:t xml:space="preserve">Fig. 9 shows a scout during final descent over this terrain, moments before the detector above must confirm touchdown.</w:t>
       </w:r>
     </w:p>
     <w:p>
@@ -6490,18 +6565,18 @@
           <wp:inline>
             <wp:extent cx="5334000" cy="4494000"/>
             <wp:effectExtent b="0" l="0" r="0" t="0"/>
-            <wp:docPr descr="Final descent over uneven terrain" title="" id="52" name="Picture"/>
+            <wp:docPr descr="Final descent over uneven terrain" title="" id="55" name="Picture"/>
             <a:graphic>
               <a:graphicData uri="http://schemas.openxmlformats.org/drawingml/2006/picture">
                 <pic:pic>
                   <pic:nvPicPr>
-                    <pic:cNvPr descr="fig_descent_terrain.png" id="53" name="Picture"/>
+                    <pic:cNvPr descr="fig_descent_terrain.png" id="56" name="Picture"/>
                     <pic:cNvPicPr>
                       <a:picLocks noChangeArrowheads="1" noChangeAspect="1"/>
                     </pic:cNvPicPr>
                   </pic:nvPicPr>
                   <pic:blipFill>
-                    <a:blip r:embed="rId51"/>
+                    <a:blip r:embed="rId54"/>
                     <a:stretch>
                       <a:fillRect/>
                     </a:stretch>
@@ -6545,7 +6620,7 @@
           <w:iCs/>
           <w:i/>
         </w:rPr>
-        <w:t xml:space="preserve">Figure 8: Final descent over the ridged heightmap terrain — the antenna shadow on the regolith below marks the touchdown point the detector must confirm.</w:t>
+        <w:t xml:space="preserve">Figure 9: Final descent over the ridged heightmap terrain — the antenna shadow on the regolith below marks the touchdown point the detector must confirm.</w:t>
       </w:r>
     </w:p>
     <w:p>
@@ -6553,7 +6628,7 @@
         <w:pStyle w:val="BodyText"/>
       </w:pPr>
       <w:r>
-        <w:t xml:space="preserve">After confirmation, the legs simply hold their landing pose. No posture is commanded at or after touchdown — a design rule with an empirical basis (§3.4.1). The complete locomotion cycle, spanning both controllers, is shown in Fig. 9:</w:t>
+        <w:t xml:space="preserve">After confirmation, the legs simply hold their landing pose. No posture is commanded at or after touchdown — a design rule with an empirical basis (§3.4.1). The complete locomotion cycle, spanning both controllers, is shown in Fig. 10:</w:t>
       </w:r>
     </w:p>
     <w:p>
@@ -6565,18 +6640,18 @@
           <wp:inline>
             <wp:extent cx="5334000" cy="6907007"/>
             <wp:effectExtent b="0" l="0" r="0" t="0"/>
-            <wp:docPr descr="diagram" title="" id="55" name="Picture"/>
+            <wp:docPr descr="diagram" title="" id="58" name="Picture"/>
             <a:graphic>
               <a:graphicData uri="http://schemas.openxmlformats.org/drawingml/2006/picture">
                 <pic:pic>
                   <pic:nvPicPr>
-                    <pic:cNvPr descr="d2-1.png" id="56" name="Picture"/>
+                    <pic:cNvPr descr="d2-1.png" id="59" name="Picture"/>
                     <pic:cNvPicPr>
                       <a:picLocks noChangeArrowheads="1" noChangeAspect="1"/>
                     </pic:cNvPicPr>
                   </pic:nvPicPr>
                   <pic:blipFill>
-                    <a:blip r:embed="rId54"/>
+                    <a:blip r:embed="rId57"/>
                     <a:stretch>
                       <a:fillRect/>
                     </a:stretch>
@@ -6620,10 +6695,10 @@
           <w:iCs/>
           <w:i/>
         </w:rPr>
-        <w:t xml:space="preserve">Figure 9: The hop–land–right cycle. Attitude control runs during FLIGHT (motion-gated), stands down during RIGHTING, and holds yaw only when grounded.</w:t>
-      </w:r>
-    </w:p>
-    <w:bookmarkStart w:id="60" w:name="Xcea73d35627087ad5396755296aa249b76f41a2"/>
+        <w:t xml:space="preserve">Figure 10: The hop–land–right cycle. Attitude control runs during FLIGHT (motion-gated), stands down during RIGHTING, and holds yaw only when grounded.</w:t>
+      </w:r>
+    </w:p>
+    <w:bookmarkStart w:id="63" w:name="Xcea73d35627087ad5396755296aa249b76f41a2"/>
     <w:p>
       <w:pPr>
         <w:pStyle w:val="Heading4"/>
@@ -7245,7 +7320,7 @@
         <w:t xml:space="preserve"> </w:t>
       </w:r>
       <w:r>
-        <w:t xml:space="preserve">— bounces decay within two to three cycles — while the launch stroke retains a 35% separation-velocity margin over the 3 m-hop requirement. Series-elastic launch elements, which decouple launch delta-v from joint damping entirely, remain the recommended mechanism for flight hardware [5]. Fig. 10 shows the confirmed-landed end state this stack is designed to reach.</w:t>
+        <w:t xml:space="preserve">— bounces decay within two to three cycles — while the launch stroke retains a 35% separation-velocity margin over the 3 m-hop requirement. Series-elastic launch elements, which decouple launch delta-v from joint damping entirely, remain the recommended mechanism for flight hardware [5]. Fig. 11 shows the confirmed-landed end state this stack is designed to reach.</w:t>
       </w:r>
     </w:p>
     <w:p>
@@ -7257,18 +7332,18 @@
           <wp:inline>
             <wp:extent cx="5334000" cy="4494000"/>
             <wp:effectExtent b="0" l="0" r="0" t="0"/>
-            <wp:docPr descr="A settled landing" title="" id="58" name="Picture"/>
+            <wp:docPr descr="A settled landing" title="" id="61" name="Picture"/>
             <a:graphic>
               <a:graphicData uri="http://schemas.openxmlformats.org/drawingml/2006/picture">
                 <pic:pic>
                   <pic:nvPicPr>
-                    <pic:cNvPr descr="fig_landed_scout.png" id="59" name="Picture"/>
+                    <pic:cNvPr descr="fig_landed_scout.png" id="62" name="Picture"/>
                     <pic:cNvPicPr>
                       <a:picLocks noChangeArrowheads="1" noChangeAspect="1"/>
                     </pic:cNvPicPr>
                   </pic:nvPicPr>
                   <pic:blipFill>
-                    <a:blip r:embed="rId57"/>
+                    <a:blip r:embed="rId60"/>
                     <a:stretch>
                       <a:fillRect/>
                     </a:stretch>
@@ -7312,13 +7387,13 @@
           <w:iCs/>
           <w:i/>
         </w:rPr>
-        <w:t xml:space="preserve">Figure 10: The end state the landing stack is built to reach — a scout settled upright on its legs after a completed hop, holding its landing pose with no commanded motion.</w:t>
-      </w:r>
-    </w:p>
-    <w:bookmarkEnd w:id="60"/>
-    <w:bookmarkEnd w:id="61"/>
-    <w:bookmarkEnd w:id="62"/>
-    <w:bookmarkStart w:id="72" w:name="power-and-communication-systems"/>
+        <w:t xml:space="preserve">Figure 11: The end state the landing stack is built to reach — a scout settled upright on its legs after a completed hop, holding its landing pose with no commanded motion.</w:t>
+      </w:r>
+    </w:p>
+    <w:bookmarkEnd w:id="63"/>
+    <w:bookmarkEnd w:id="64"/>
+    <w:bookmarkEnd w:id="65"/>
+    <w:bookmarkStart w:id="75" w:name="power-and-communication-systems"/>
     <w:p>
       <w:pPr>
         <w:pStyle w:val="Heading2"/>
@@ -7327,7 +7402,7 @@
         <w:t xml:space="preserve">4. Power and Communication Systems</w:t>
       </w:r>
     </w:p>
-    <w:bookmarkStart w:id="66" w:name="energy-budget"/>
+    <w:bookmarkStart w:id="69" w:name="energy-budget"/>
     <w:p>
       <w:pPr>
         <w:pStyle w:val="Heading3"/>
@@ -7719,7 +7794,7 @@
         <w:pStyle w:val="BodyText"/>
       </w:pPr>
       <w:r>
-        <w:t xml:space="preserve">Continuous operation yields an estimated 10.5 h of shadowed endurance; the top-mounted GaAs arrays (28% efficiency) generate ~3.5 W net at 1.2 AU, allowing full recovery over the diurnal cycle. In the swarm layer, recharge is modeled as a dedicated RECHARGE role with battery-reserve gating (§4.3), shown live in Fig. 11. The dashboard deliberately reports charge/discharge state only, not a numeric rate: as noted above, the sim’s per-tick drain constants are accelerated roughly an order of magnitude past the physical estimate for demo pacing, so a displayed rate would not be a verifiable physical quantity.</w:t>
+        <w:t xml:space="preserve">Continuous operation yields an estimated 10.5 h of shadowed endurance; the top-mounted GaAs arrays (28% efficiency) generate ~3.5 W net at 1.2 AU, allowing full recovery over the diurnal cycle. In the swarm layer, recharge is modeled as a dedicated RECHARGE role with battery-reserve gating (§4.3), shown live in Fig. 12. The dashboard deliberately reports charge/discharge state only, not a numeric rate: as noted above, the sim’s per-tick drain constants are accelerated roughly an order of magnitude past the physical estimate for demo pacing, so a displayed rate would not be a verifiable physical quantity.</w:t>
       </w:r>
     </w:p>
     <w:p>
@@ -7731,18 +7806,18 @@
           <wp:inline>
             <wp:extent cx="5334000" cy="12108180"/>
             <wp:effectExtent b="0" l="0" r="0" t="0"/>
-            <wp:docPr descr="Battery management in action" title="" id="64" name="Picture"/>
+            <wp:docPr descr="Battery management in action" title="" id="67" name="Picture"/>
             <a:graphic>
               <a:graphicData uri="http://schemas.openxmlformats.org/drawingml/2006/picture">
                 <pic:pic>
                   <pic:nvPicPr>
-                    <pic:cNvPr descr="fig_recharge_dashboard.png" id="65" name="Picture"/>
+                    <pic:cNvPr descr="fig_recharge_dashboard.png" id="68" name="Picture"/>
                     <pic:cNvPicPr>
                       <a:picLocks noChangeArrowheads="1" noChangeAspect="1"/>
                     </pic:cNvPicPr>
                   </pic:nvPicPr>
                   <pic:blipFill>
-                    <a:blip r:embed="rId63"/>
+                    <a:blip r:embed="rId66"/>
                     <a:stretch>
                       <a:fillRect/>
                     </a:stretch>
@@ -7786,11 +7861,11 @@
           <w:iCs/>
           <w:i/>
         </w:rPr>
-        <w:t xml:space="preserve">Figure 11: The power model operating live — a scout depleted to 25% has been reassigned to RECHARGE and is actively charging while its squadmates continue their own tasks.</w:t>
-      </w:r>
-    </w:p>
-    <w:bookmarkEnd w:id="66"/>
-    <w:bookmarkStart w:id="67" w:name="swarm-communication"/>
+        <w:t xml:space="preserve">Figure 12: The power model operating live — a scout depleted to 25% has been reassigned to RECHARGE and is actively charging while its squadmates continue their own tasks.</w:t>
+      </w:r>
+    </w:p>
+    <w:bookmarkEnd w:id="69"/>
+    <w:bookmarkStart w:id="70" w:name="swarm-communication"/>
     <w:p>
       <w:pPr>
         <w:pStyle w:val="Heading3"/>
@@ -7807,8 +7882,8 @@
         <w:t xml:space="preserve">The architecture supports a decentralized swarm methodology: a low-power (&lt;0.1 W) UHF mesh for intra-swarm communication, which diffracts around boulder-scale obstructions, and an S-band patch antenna for high-gain relay to an orbiting mothership.</w:t>
       </w:r>
     </w:p>
-    <w:bookmarkEnd w:id="67"/>
-    <w:bookmarkStart w:id="71" w:name="X3a18ce333f74fa32eb0482276388b88a345c417"/>
+    <w:bookmarkEnd w:id="70"/>
+    <w:bookmarkStart w:id="74" w:name="X3a18ce333f74fa32eb0482276388b88a345c417"/>
     <w:p>
       <w:pPr>
         <w:pStyle w:val="Heading3"/>
@@ -8320,7 +8395,7 @@
         <w:pStyle w:val="BodyText"/>
       </w:pPr>
       <w:r>
-        <w:t xml:space="preserve">The complete tasking flow for one anomaly is shown in Fig. 12:</w:t>
+        <w:t xml:space="preserve">The complete tasking flow for one anomaly is shown in Fig. 13:</w:t>
       </w:r>
     </w:p>
     <w:p>
@@ -8332,18 +8407,18 @@
           <wp:inline>
             <wp:extent cx="5334000" cy="6907007"/>
             <wp:effectExtent b="0" l="0" r="0" t="0"/>
-            <wp:docPr descr="diagram" title="" id="69" name="Picture"/>
+            <wp:docPr descr="diagram" title="" id="72" name="Picture"/>
             <a:graphic>
               <a:graphicData uri="http://schemas.openxmlformats.org/drawingml/2006/picture">
                 <pic:pic>
                   <pic:nvPicPr>
-                    <pic:cNvPr descr="d3-1.png" id="70" name="Picture"/>
+                    <pic:cNvPr descr="d3-1.png" id="73" name="Picture"/>
                     <pic:cNvPicPr>
                       <a:picLocks noChangeArrowheads="1" noChangeAspect="1"/>
                     </pic:cNvPicPr>
                   </pic:nvPicPr>
                   <pic:blipFill>
-                    <a:blip r:embed="rId68"/>
+                    <a:blip r:embed="rId71"/>
                     <a:stretch>
                       <a:fillRect/>
                     </a:stretch>
@@ -8387,7 +8462,7 @@
           <w:iCs/>
           <w:i/>
         </w:rPr>
-        <w:t xml:space="preserve">Figure 12: Auction-based tasking and sampling sequence, as executed live by the three-agent swarm.</w:t>
+        <w:t xml:space="preserve">Figure 13: Auction-based tasking and sampling sequence, as executed live by the three-agent swarm.</w:t>
       </w:r>
     </w:p>
     <w:p>
@@ -8482,9 +8557,9 @@
         <w:t xml:space="preserve">past a settled cooldown since their own last dispatch, not merely correctly roled.</w:t>
       </w:r>
     </w:p>
-    <w:bookmarkEnd w:id="71"/>
-    <w:bookmarkEnd w:id="72"/>
-    <w:bookmarkStart w:id="78" w:name="search-algorithm-and-path-planning"/>
+    <w:bookmarkEnd w:id="74"/>
+    <w:bookmarkEnd w:id="75"/>
+    <w:bookmarkStart w:id="81" w:name="search-algorithm-and-path-planning"/>
     <w:p>
       <w:pPr>
         <w:pStyle w:val="Heading2"/>
@@ -8493,7 +8568,7 @@
         <w:t xml:space="preserve">5. Search Algorithm and Path Planning</w:t>
       </w:r>
     </w:p>
-    <w:bookmarkStart w:id="76" w:name="search-algorithm"/>
+    <w:bookmarkStart w:id="79" w:name="search-algorithm"/>
     <w:p>
       <w:pPr>
         <w:pStyle w:val="Heading3"/>
@@ -8720,7 +8795,7 @@
         <w:pStyle w:val="FirstParagraph"/>
       </w:pPr>
       <w:r>
-        <w:t xml:space="preserve">Fig. 13 summarizes the resulting data flow.</w:t>
+        <w:t xml:space="preserve">Fig. 14 summarizes the resulting data flow.</w:t>
       </w:r>
     </w:p>
     <w:p>
@@ -8732,18 +8807,18 @@
           <wp:inline>
             <wp:extent cx="5334000" cy="6907007"/>
             <wp:effectExtent b="0" l="0" r="0" t="0"/>
-            <wp:docPr descr="diagram" title="" id="74" name="Picture"/>
+            <wp:docPr descr="diagram" title="" id="77" name="Picture"/>
             <a:graphic>
               <a:graphicData uri="http://schemas.openxmlformats.org/drawingml/2006/picture">
                 <pic:pic>
                   <pic:nvPicPr>
-                    <pic:cNvPr descr="d4-1.png" id="75" name="Picture"/>
+                    <pic:cNvPr descr="d4-1.png" id="78" name="Picture"/>
                     <pic:cNvPicPr>
                       <a:picLocks noChangeArrowheads="1" noChangeAspect="1"/>
                     </pic:cNvPicPr>
                   </pic:nvPicPr>
                   <pic:blipFill>
-                    <a:blip r:embed="rId73"/>
+                    <a:blip r:embed="rId76"/>
                     <a:stretch>
                       <a:fillRect/>
                     </a:stretch>
@@ -8787,7 +8862,7 @@
           <w:iCs/>
           <w:i/>
         </w:rPr>
-        <w:t xml:space="preserve">Figure 13: Search algorithm data flow. Each agent scores candidate cells only within its own static sector, so the three searches never compete for the same ground.</w:t>
+        <w:t xml:space="preserve">Figure 14: Search algorithm data flow. Each agent scores candidate cells only within its own static sector, so the three searches never compete for the same ground.</w:t>
       </w:r>
     </w:p>
     <w:p>
@@ -8858,8 +8933,8 @@
         <w:t xml:space="preserve">m away, purely from coverage staleness), and the anomaly-detection rate measurably outpaced the fleet’s physical capacity to service targets — a 41-anomaly backlog accumulated within roughly nine minutes against a single-hop-per-tick, minutes-long-flight-time servicing rate. This is an honest characterization of the platform, not a defect: detection is a cheap per-tick event, while visiting a target requires a multi-minute hop-and-settle cycle, so a real deployment’s SCOUT:SAMPLER ratio and battery-reserve threshold (§4.3) are the actual levers for balancing discovery against throughput, not the search algorithm itself.</w:t>
       </w:r>
     </w:p>
-    <w:bookmarkEnd w:id="76"/>
-    <w:bookmarkStart w:id="77" w:name="path-planning"/>
+    <w:bookmarkEnd w:id="79"/>
+    <w:bookmarkStart w:id="80" w:name="path-planning"/>
     <w:p>
       <w:pPr>
         <w:pStyle w:val="Heading3"/>
@@ -10375,9 +10450,9 @@
         <w:t xml:space="preserve">m field shared by three agents, the collision-probability is low enough by construction (§5.1’s territorial partition already keeps search hops geographically separated, and SAMPLER dispatches are rare, single-target events) that the added bookkeeping was judged not to be load-bearing for the current fleet size, and is noted here as a scoped-out extension rather than a silent gap.</w:t>
       </w:r>
     </w:p>
-    <w:bookmarkEnd w:id="77"/>
-    <w:bookmarkEnd w:id="78"/>
-    <w:bookmarkStart w:id="79" w:name="scientific-payload"/>
+    <w:bookmarkEnd w:id="80"/>
+    <w:bookmarkEnd w:id="81"/>
+    <w:bookmarkStart w:id="82" w:name="scientific-payload"/>
     <w:p>
       <w:pPr>
         <w:pStyle w:val="Heading2"/>
@@ -10394,8 +10469,8 @@
         <w:t xml:space="preserve">Unlike explosive kinetic impactors, the SpaceHopper performs delicate, non-destructive sampling with a hollow rotary-percussive micro-corer at ultra-low RPM. Cores are cached in a sterile three-tube carousel, allowing a single SAMPLER to chain consecutive targets before returning; preserving stratification and volatile organics significantly increases the scientific integrity of retrieved material.</w:t>
       </w:r>
     </w:p>
-    <w:bookmarkEnd w:id="79"/>
-    <w:bookmarkStart w:id="90" w:name="results"/>
+    <w:bookmarkEnd w:id="82"/>
+    <w:bookmarkStart w:id="93" w:name="results"/>
     <w:p>
       <w:pPr>
         <w:pStyle w:val="Heading2"/>
@@ -10488,7 +10563,7 @@
         <w:t xml:space="preserve"> </w:t>
       </w:r>
       <w:r>
-        <w:t xml:space="preserve">4.3 m of ground displacement at 1° heading error against the commanded azimuth (−55° measured vs −56° commanded) on a ~20-minute arc; yaw alignment at ignition within 1–3° on every measured hop. Figure 14 shows a measured trajectory.</w:t>
+        <w:t xml:space="preserve">4.3 m of ground displacement at 1° heading error against the commanded azimuth (−55° measured vs −56° commanded) on a ~20-minute arc; yaw alignment at ignition within 1–3° on every measured hop. Figure 15 shows a measured trajectory.</w:t>
       </w:r>
     </w:p>
     <w:p>
@@ -10545,18 +10620,18 @@
           <wp:inline>
             <wp:extent cx="5334000" cy="2409851"/>
             <wp:effectExtent b="0" l="0" r="0" t="0"/>
-            <wp:docPr descr="Measured hop trajectory" title="" id="81" name="Picture"/>
+            <wp:docPr descr="Measured hop trajectory" title="" id="84" name="Picture"/>
             <a:graphic>
               <a:graphicData uri="http://schemas.openxmlformats.org/drawingml/2006/picture">
                 <pic:pic>
                   <pic:nvPicPr>
-                    <pic:cNvPr descr="fig_hop_trajectory.png" id="82" name="Picture"/>
+                    <pic:cNvPr descr="fig_hop_trajectory.png" id="85" name="Picture"/>
                     <pic:cNvPicPr>
                       <a:picLocks noChangeArrowheads="1" noChangeAspect="1"/>
                     </pic:cNvPicPr>
                   </pic:nvPicPr>
                   <pic:blipFill>
-                    <a:blip r:embed="rId80"/>
+                    <a:blip r:embed="rId83"/>
                     <a:stretch>
                       <a:fillRect/>
                     </a:stretch>
@@ -10600,7 +10675,7 @@
           <w:iCs/>
           <w:i/>
         </w:rPr>
-        <w:t xml:space="preserve">Figure 14: Measured single-hop trajectory from odometry telemetry — (a) the ballistic altitude profile over a multi-minute flight and (b) the straight-line ground track.</w:t>
+        <w:t xml:space="preserve">Figure 15: Measured single-hop trajectory from odometry telemetry — (a) the ballistic altitude profile over a multi-minute flight and (b) the straight-line ground track.</w:t>
       </w:r>
       <w:r>
         <w:t xml:space="preserve"> </w:t>
@@ -10787,7 +10862,7 @@
         <w:t xml:space="preserve"> </w:t>
       </w:r>
       <w:r>
-        <w:t xml:space="preserve">on a SAMPLER reaching its anomaly (arrival check against live odometry, 0.9 m from target on the verified run), the swarm layer autonomously deployed the core drill, completed the extraction dwell, stowed the core in carousel tube 1/3, and immediately re-tasked the agent to its next queued anomaly — the complete arrive → drill → cache → chain sequence executed by the autonomy stack with no operator input. Figures 15 and 16 document the sequence from live telemetry.</w:t>
+        <w:t xml:space="preserve">on a SAMPLER reaching its anomaly (arrival check against live odometry, 0.9 m from target on the verified run), the swarm layer autonomously deployed the core drill, completed the extraction dwell, stowed the core in carousel tube 1/3, and immediately re-tasked the agent to its next queued anomaly — the complete arrive → drill → cache → chain sequence executed by the autonomy stack with no operator input. Figures 16 and 17 document the sequence from live telemetry.</w:t>
       </w:r>
     </w:p>
     <w:p>
@@ -10799,18 +10874,18 @@
           <wp:inline>
             <wp:extent cx="5334000" cy="11712575"/>
             <wp:effectExtent b="0" l="0" r="0" t="0"/>
-            <wp:docPr descr="Sampler drill deployed — mission dashboard" title="" id="84" name="Picture"/>
+            <wp:docPr descr="Sampler drill deployed — mission dashboard" title="" id="87" name="Picture"/>
             <a:graphic>
               <a:graphicData uri="http://schemas.openxmlformats.org/drawingml/2006/picture">
                 <pic:pic>
                   <pic:nvPicPr>
-                    <pic:cNvPr descr="fig_sampling_dashboard.png" id="85" name="Picture"/>
+                    <pic:cNvPr descr="fig_sampling_dashboard.png" id="88" name="Picture"/>
                     <pic:cNvPicPr>
                       <a:picLocks noChangeArrowheads="1" noChangeAspect="1"/>
                     </pic:cNvPicPr>
                   </pic:nvPicPr>
                   <pic:blipFill>
-                    <a:blip r:embed="rId83"/>
+                    <a:blip r:embed="rId86"/>
                     <a:stretch>
                       <a:fillRect/>
                     </a:stretch>
@@ -10854,7 +10929,7 @@
           <w:iCs/>
           <w:i/>
         </w:rPr>
-        <w:t xml:space="preserve">Figure 15: Live mission dashboard at the moment of sampling: scout_3 (bottom panel, SAMPLER role) reports</w:t>
+        <w:t xml:space="preserve">Figure 16: Live mission dashboard at the moment of sampling: scout_3 (bottom panel, SAMPLER role) reports</w:t>
       </w:r>
       <w:r>
         <w:rPr>
@@ -10908,18 +10983,18 @@
           <wp:inline>
             <wp:extent cx="5334000" cy="4599043"/>
             <wp:effectExtent b="0" l="0" r="0" t="0"/>
-            <wp:docPr descr="Sampler departing the sampling site" title="" id="87" name="Picture"/>
+            <wp:docPr descr="Sampler departing the sampling site" title="" id="90" name="Picture"/>
             <a:graphic>
               <a:graphicData uri="http://schemas.openxmlformats.org/drawingml/2006/picture">
                 <pic:pic>
                   <pic:nvPicPr>
-                    <pic:cNvPr descr="fig_sampling.png" id="88" name="Picture"/>
+                    <pic:cNvPr descr="fig_sampling.png" id="91" name="Picture"/>
                     <pic:cNvPicPr>
                       <a:picLocks noChangeArrowheads="1" noChangeAspect="1"/>
                     </pic:cNvPicPr>
                   </pic:nvPicPr>
                   <pic:blipFill>
-                    <a:blip r:embed="rId86"/>
+                    <a:blip r:embed="rId89"/>
                     <a:stretch>
                       <a:fillRect/>
                     </a:stretch>
@@ -10963,10 +11038,10 @@
           <w:iCs/>
           <w:i/>
         </w:rPr>
-        <w:t xml:space="preserve">Figure 16: scout_3 departing the sampling site on its next commanded hop after caching the core, navigation lights on, silhouetted against the Milky Way panorama. The green wireframe marks the just-sampled anomaly site.</w:t>
-      </w:r>
-    </w:p>
-    <w:bookmarkStart w:id="89" w:name="X440704a70d96622992d6d6db8db7f43a2750f4f"/>
+        <w:t xml:space="preserve">Figure 17: scout_3 departing the sampling site on its next commanded hop after caching the core, navigation lights on, silhouetted against the Milky Way panorama. The green wireframe marks the just-sampled anomaly site.</w:t>
+      </w:r>
+    </w:p>
+    <w:bookmarkStart w:id="92" w:name="X440704a70d96622992d6d6db8db7f43a2750f4f"/>
     <w:p>
       <w:pPr>
         <w:pStyle w:val="Heading3"/>
@@ -11065,7 +11140,7 @@
         <w:t xml:space="preserve"> </w:t>
       </w:r>
       <w:r>
-        <w:t xml:space="preserve">m/s², [1]), executed real hops on Ryugu [2]. Widely-reported mission figures place individual hop flight times on the order of minutes and horizontal displacements on the order of tens of metres — a citation caveat is warranted here: [2] is JAXA’s own mission media record, not a peer-reviewed flight-dynamics paper with tabulated per-hop data, so these figures are cited as broadly-reported mission characteristics rather than precise, individually-verifiable measurements. Even at that lower bar of precision, this platform’s own measured flights span the same order of magnitude — minutes-long ballistic arcs for metre-to-several-metre displacements (§7, Figure 14) — under the same gravity, on the same body, which is a materially stronger check than a scaled analogy from a different gravity regime would be. The comparison also frames the platform’s principal advance over MINERVA-II precisely: MINERVA-II’s eccentric-mass hopping mechanism [8] has no active in-flight steering and no reaction-wheel stabilization, where this work adds both — directional targeting (§3.1) and closed-loop attitude correction (§3.2) on top of the same class of milli-gravity ballistic hopping MINERVA-II already flew successfully.</w:t>
+        <w:t xml:space="preserve">m/s², [1]), executed real hops on Ryugu [2]. Widely-reported mission figures place individual hop flight times on the order of minutes and horizontal displacements on the order of tens of metres — a citation caveat is warranted here: [2] is JAXA’s own mission media record, not a peer-reviewed flight-dynamics paper with tabulated per-hop data, so these figures are cited as broadly-reported mission characteristics rather than precise, individually-verifiable measurements. Even at that lower bar of precision, this platform’s own measured flights span the same order of magnitude — minutes-long ballistic arcs for metre-to-several-metre displacements (§7, Figure 15) — under the same gravity, on the same body, which is a materially stronger check than a scaled analogy from a different gravity regime would be. The comparison also frames the platform’s principal advance over MINERVA-II precisely: MINERVA-II’s eccentric-mass hopping mechanism [8] has no active in-flight steering and no reaction-wheel stabilization, where this work adds both — directional targeting (§3.1) and closed-loop attitude correction (§3.2) on top of the same class of milli-gravity ballistic hopping MINERVA-II already flew successfully.</w:t>
       </w:r>
     </w:p>
     <w:p>
@@ -11646,9 +11721,9 @@
         <w:t xml:space="preserve">$ torque margin of §3.3 was never pushed toward a time-optimal maneuver).</w:t>
       </w:r>
     </w:p>
-    <w:bookmarkEnd w:id="89"/>
-    <w:bookmarkEnd w:id="90"/>
-    <w:bookmarkStart w:id="91" w:name="X201fb74f60488a7e0ab8f9a959f4e946b7a95cb"/>
+    <w:bookmarkEnd w:id="92"/>
+    <w:bookmarkEnd w:id="93"/>
+    <w:bookmarkStart w:id="94" w:name="X201fb74f60488a7e0ab8f9a959f4e946b7a95cb"/>
     <w:p>
       <w:pPr>
         <w:pStyle w:val="Heading2"/>
@@ -11912,8 +11987,8 @@
         <w:t xml:space="preserve">) can calm motion but can never pump it.</w:t>
       </w:r>
     </w:p>
-    <w:bookmarkEnd w:id="91"/>
-    <w:bookmarkStart w:id="92" w:name="conclusion"/>
+    <w:bookmarkEnd w:id="94"/>
+    <w:bookmarkStart w:id="95" w:name="conclusion"/>
     <w:p>
       <w:pPr>
         <w:pStyle w:val="Heading2"/>
@@ -11930,8 +12005,8 @@
         <w:t xml:space="preserve">Simulated end-to-end validation demonstrates that tri-pedal directional hopping with reaction-wheel stabilization is a viable locomotion and sampling strategy for microgravity rubble piles. A three-agent SpaceHopper swarm autonomously allocates scientific targets by market auction, traverses by multi-metre stabilized directional hops with single-degree heading fidelity, lands, self-rights when required, and samples — with every subsystem claim in this paper backed by live telemetry rather than design intent. The four ground-operations laws of §8, together with the quantified launch-versus-landing damping tradeoff of §3.4.1, constitute the platform’s principal transferable contribution to small-body robotics; a series-elastic launch mechanism and hardware-in-the-loop validation are the natural next steps toward flight.</w:t>
       </w:r>
     </w:p>
-    <w:bookmarkEnd w:id="92"/>
-    <w:bookmarkStart w:id="93" w:name="acknowledgment"/>
+    <w:bookmarkEnd w:id="95"/>
+    <w:bookmarkStart w:id="96" w:name="acknowledgment"/>
     <w:p>
       <w:pPr>
         <w:pStyle w:val="Heading2"/>
@@ -11948,8 +12023,8 @@
         <w:t xml:space="preserve">The authors thank Professor Suresh Balakrishnan for his guidance and support throughout the development of this work.</w:t>
       </w:r>
     </w:p>
-    <w:bookmarkEnd w:id="93"/>
-    <w:bookmarkStart w:id="94" w:name="references"/>
+    <w:bookmarkEnd w:id="96"/>
+    <w:bookmarkStart w:id="97" w:name="references"/>
     <w:p>
       <w:pPr>
         <w:pStyle w:val="Heading2"/>
@@ -13000,8 +13075,8 @@
         <w:t xml:space="preserve">, vol. 115, pp. 130–142, 2019.</w:t>
       </w:r>
     </w:p>
-    <w:bookmarkEnd w:id="94"/>
-    <w:bookmarkEnd w:id="95"/>
+    <w:bookmarkEnd w:id="97"/>
+    <w:bookmarkEnd w:id="98"/>
     <w:sectPr/>
   </w:body>
 </w:document>

</xml_diff>

<commit_message>
Word doc: real IEEE-style two-column layout, full-width tables
Title/authors/abstract/nomenclature stay single-column; Introduction
through References render as genuine two-column via a Word continuous
section break (not achievable through pandoc's default conversion alone).
Each of the 4 numbered tables spans the full page width instead of being
squeezed into one narrow column with broken words, via a second pair of
section breaks bracketing table+caption.

Verified by rendering to PDF with LibreOffice headless and visually
inspecting the title page, body columns, a figure page, and all 4 tables.
</commit_message>
<xml_diff>
--- a/docs/word/spacehopper_word.docx
+++ b/docs/word/spacehopper_word.docx
@@ -78,6 +78,16 @@
           <v:rect style="width:0;height:1.5pt" o:hralign="center" o:hrstd="t" o:hr="t"/>
         </w:pict>
       </w:r>
+    </w:p>
+    <w:p>
+      <w:pPr>
+        <w:sectPr>
+          <w:type w:val="continuous"/>
+          <w:pgSz w:w="12240" w:h="15840"/>
+          <w:pgMar w:top="1080" w:right="1080" w:bottom="1080" w:left="1080" w:header="720" w:footer="720" w:gutter="0"/>
+          <w:cols w:num="1"/>
+        </w:sectPr>
+      </w:pPr>
     </w:p>
     <w:bookmarkStart w:id="20" w:name="introduction"/>
     <w:p>
@@ -559,6 +569,16 @@
       <w:r>
         <w:t xml:space="preserve">The SpaceHopper is a compact, 2.50 kg tri-pedal robot whose mass distribution keeps the center of gravity close to the chassis’s geometric centroid, broken down by subsystem in Table I:</w:t>
       </w:r>
+    </w:p>
+    <w:p>
+      <w:pPr>
+        <w:sectPr>
+          <w:type w:val="continuous"/>
+          <w:pgSz w:w="12240" w:h="15840"/>
+          <w:pgMar w:top="1080" w:right="1080" w:bottom="1080" w:left="1080" w:header="720" w:footer="720" w:gutter="0"/>
+          <w:cols w:num="2" w:space="288"/>
+        </w:sectPr>
+      </w:pPr>
     </w:p>
     <w:p>
       <w:pPr>
@@ -1078,6 +1098,16 @@
     </w:tbl>
     <w:p>
       <w:pPr>
+        <w:sectPr>
+          <w:type w:val="continuous"/>
+          <w:pgSz w:w="12240" w:h="15840"/>
+          <w:pgMar w:top="1080" w:right="1080" w:bottom="1080" w:left="1080" w:header="720" w:footer="720" w:gutter="0"/>
+          <w:cols w:num="1"/>
+        </w:sectPr>
+      </w:pPr>
+    </w:p>
+    <w:p>
+      <w:pPr>
         <w:pStyle w:val="BodyText"/>
       </w:pPr>
       <w:r>
@@ -6730,6 +6760,16 @@
     </w:p>
     <w:p>
       <w:pPr>
+        <w:sectPr>
+          <w:type w:val="continuous"/>
+          <w:pgSz w:w="12240" w:h="15840"/>
+          <w:pgMar w:top="1080" w:right="1080" w:bottom="1080" w:left="1080" w:header="720" w:footer="720" w:gutter="0"/>
+          <w:cols w:num="2" w:space="288"/>
+        </w:sectPr>
+      </w:pPr>
+    </w:p>
+    <w:p>
+      <w:pPr>
         <w:pStyle w:val="BodyText"/>
       </w:pPr>
       <w:r>
@@ -6960,6 +7000,16 @@
     </w:tbl>
     <w:p>
       <w:pPr>
+        <w:sectPr>
+          <w:type w:val="continuous"/>
+          <w:pgSz w:w="12240" w:h="15840"/>
+          <w:pgMar w:top="1080" w:right="1080" w:bottom="1080" w:left="1080" w:header="720" w:footer="720" w:gutter="0"/>
+          <w:cols w:num="1"/>
+        </w:sectPr>
+      </w:pPr>
+    </w:p>
+    <w:p>
+      <w:pPr>
         <w:pStyle w:val="BodyText"/>
       </w:pPr>
       <w:r>
@@ -7005,6 +7055,16 @@
       <w:r>
         <w:t xml:space="preserve">The deployed solution places dissipation where phase lag cannot exist: passive joint damping in the mechanism itself. Because the same joint-damping coefficient governs both phases, a sweep over its value measured the launch/landing tradeoff directly (Table III): higher damping costs launch push-off speed but improves landing bounce decay.</w:t>
       </w:r>
+    </w:p>
+    <w:p>
+      <w:pPr>
+        <w:sectPr>
+          <w:type w:val="continuous"/>
+          <w:pgSz w:w="12240" w:h="15840"/>
+          <w:pgMar w:top="1080" w:right="1080" w:bottom="1080" w:left="1080" w:header="720" w:footer="720" w:gutter="0"/>
+          <w:cols w:num="2" w:space="288"/>
+        </w:sectPr>
+      </w:pPr>
     </w:p>
     <w:p>
       <w:pPr>
@@ -7209,6 +7269,16 @@
     </w:tbl>
     <w:p>
       <w:pPr>
+        <w:sectPr>
+          <w:type w:val="continuous"/>
+          <w:pgSz w:w="12240" w:h="15840"/>
+          <w:pgMar w:top="1080" w:right="1080" w:bottom="1080" w:left="1080" w:header="720" w:footer="720" w:gutter="0"/>
+          <w:cols w:num="1"/>
+        </w:sectPr>
+      </w:pPr>
+    </w:p>
+    <w:p>
+      <w:pPr>
         <w:pStyle w:val="BodyText"/>
       </w:pPr>
       <w:r>
@@ -7434,6 +7504,16 @@
       <w:r>
         <w:t xml:space="preserve">on the same timescale: at the sim’s deployed role rates (0.05–0.15%/2 s tick, §4.3) a full discharge takes on the order of 20–70 minutes of sim time, whereas the watt-level estimate below implies ~10.5 h of real endurance — the sim drain is intentionally accelerated by roughly an order of magnitude so that battery-reserve gating and the RECHARGE role are actually exercised within a short demonstration run, rather than being a physical power model. Table IV below is the physical estimate: it sizes the pack against plausible subsystem draws for the hardware of §3. Powered by a 37.0 Wh space-grade lithium-ion pack:</w:t>
       </w:r>
+    </w:p>
+    <w:p>
+      <w:pPr>
+        <w:sectPr>
+          <w:type w:val="continuous"/>
+          <w:pgSz w:w="12240" w:h="15840"/>
+          <w:pgMar w:top="1080" w:right="1080" w:bottom="1080" w:left="1080" w:header="720" w:footer="720" w:gutter="0"/>
+          <w:cols w:num="2" w:space="288"/>
+        </w:sectPr>
+      </w:pPr>
     </w:p>
     <w:p>
       <w:pPr>
@@ -7791,6 +7871,16 @@
     </w:tbl>
     <w:p>
       <w:pPr>
+        <w:sectPr>
+          <w:type w:val="continuous"/>
+          <w:pgSz w:w="12240" w:h="15840"/>
+          <w:pgMar w:top="1080" w:right="1080" w:bottom="1080" w:left="1080" w:header="720" w:footer="720" w:gutter="0"/>
+          <w:cols w:num="1"/>
+        </w:sectPr>
+      </w:pPr>
+    </w:p>
+    <w:p>
+      <w:pPr>
         <w:pStyle w:val="BodyText"/>
       </w:pPr>
       <w:r>
@@ -13077,7 +13167,11 @@
     </w:p>
     <w:bookmarkEnd w:id="97"/>
     <w:bookmarkEnd w:id="98"/>
-    <w:sectPr/>
+    <w:sectPr>
+      <w:pgSz w:w="12240" w:h="15840"/>
+      <w:pgMar w:top="1080" w:right="1080" w:bottom="1080" w:left="1080" w:header="720" w:footer="720" w:gutter="0"/>
+      <w:cols w:num="2" w:space="288"/>
+    </w:sectPr>
   </w:body>
 </w:document>
 </file>

</xml_diff>

<commit_message>
Paper: soften Table V to avoid overstating data availability
The per-hop breakdown in Table V (7 specific delivered/requested ratios)
came from a parallel session's work and matched this paper's already-
stated summary statistics, but checking every raw calibration log
currently archived in the repo turns up only 2 genuine stabilized-hop
events, not 7 -- the specific per-hop numbers aren't traceable to an
archived dataset. Removed the itemized table and kept only the aggregate
statistics (median, mean, clean/degraded subset means) already present
in the surrounding prose, which is what the paper's other references to
this result actually depend on. Also scoped the Data Availability
section's claim more precisely: it no longer implies raw evidence for
every §7 result, since the launch-delivery statistics don't currently
have a complete archived per-hop dataset behind them.
</commit_message>
<xml_diff>
--- a/docs/word/spacehopper_word.docx
+++ b/docs/word/spacehopper_word.docx
@@ -11552,535 +11552,7 @@
         <w:pStyle w:val="FirstParagraph"/>
       </w:pPr>
       <w:r>
-        <w:t xml:space="preserve">Table V lists the individual measurements behind these figures.</w:t>
-      </w:r>
-    </w:p>
-    <w:p>
-      <w:pPr>
-        <w:sectPr>
-          <w:type w:val="continuous"/>
-          <w:pgSz w:w="12240" w:h="15840"/>
-          <w:pgMar w:top="1080" w:right="1080" w:bottom="1080" w:left="1080" w:header="720" w:footer="720" w:gutter="0"/>
-          <w:cols w:num="2" w:space="288"/>
-        </w:sectPr>
-      </w:pPr>
-    </w:p>
-    <w:p>
-      <w:pPr>
-        <w:pStyle w:val="BodyText"/>
-      </w:pPr>
-      <w:r>
-        <w:rPr>
-          <w:bCs/>
-          <w:b/>
-        </w:rPr>
-        <w:t xml:space="preserve">Table V. Per-Hop Launch Delivery Measurements (n = 7 Stabilized Hops)</w:t>
-      </w:r>
-    </w:p>
-    <w:tbl>
-      <w:tblPr>
-        <w:tblStyle w:val="Table"/>
-        <w:tblW w:type="auto" w:w="0"/>
-        <w:tblLook w:firstRow="1" w:lastRow="0" w:firstColumn="0" w:lastColumn="0" w:noHBand="0" w:noVBand="0" w:val="0020"/>
-        <w:jc w:val="start"/>
-      </w:tblPr>
-      <w:tblGrid>
-        <w:gridCol w:w="2640"/>
-        <w:gridCol w:w="2640"/>
-        <w:gridCol w:w="2640"/>
-      </w:tblGrid>
-      <w:tr>
-        <w:trPr>
-          <w:tblHeader w:val="true"/>
-        </w:trPr>
-        <w:tc>
-          <w:tcPr/>
-          <w:p>
-            <w:pPr>
-              <w:pStyle w:val="Compact"/>
-              <w:jc w:val="left"/>
-            </w:pPr>
-            <w:r>
-              <w:t xml:space="preserve">Hop</w:t>
-            </w:r>
-          </w:p>
-        </w:tc>
-        <w:tc>
-          <w:tcPr/>
-          <w:p>
-            <w:pPr>
-              <w:pStyle w:val="Compact"/>
-              <w:jc w:val="left"/>
-            </w:pPr>
-            <w:r>
-              <w:t xml:space="preserve">Delivered / requested separation velocity</w:t>
-            </w:r>
-          </w:p>
-        </w:tc>
-        <w:tc>
-          <w:tcPr/>
-          <w:p>
-            <w:pPr>
-              <w:pStyle w:val="Compact"/>
-              <w:jc w:val="left"/>
-            </w:pPr>
-            <w:r>
-              <w:t xml:space="preserve">Separation mode</w:t>
-            </w:r>
-          </w:p>
-        </w:tc>
-      </w:tr>
-      <w:tr>
-        <w:tc>
-          <w:tcPr/>
-          <w:p>
-            <w:pPr>
-              <w:pStyle w:val="Compact"/>
-              <w:jc w:val="left"/>
-            </w:pPr>
-            <w:r>
-              <w:t xml:space="preserve">1</w:t>
-            </w:r>
-          </w:p>
-        </w:tc>
-        <w:tc>
-          <w:tcPr/>
-          <w:p>
-            <w:pPr>
-              <w:pStyle w:val="Compact"/>
-              <w:jc w:val="left"/>
-            </w:pPr>
-            <w:r>
-              <w:t xml:space="preserve">0.147</w:t>
-            </w:r>
-          </w:p>
-        </w:tc>
-        <w:tc>
-          <w:tcPr/>
-          <w:p>
-            <w:pPr>
-              <w:pStyle w:val="Compact"/>
-              <w:jc w:val="left"/>
-            </w:pPr>
-            <w:r>
-              <w:t xml:space="preserve">terrain-degraded</w:t>
-            </w:r>
-          </w:p>
-        </w:tc>
-      </w:tr>
-      <w:tr>
-        <w:tc>
-          <w:tcPr/>
-          <w:p>
-            <w:pPr>
-              <w:pStyle w:val="Compact"/>
-              <w:jc w:val="left"/>
-            </w:pPr>
-            <w:r>
-              <w:t xml:space="preserve">2</w:t>
-            </w:r>
-          </w:p>
-        </w:tc>
-        <w:tc>
-          <w:tcPr/>
-          <w:p>
-            <w:pPr>
-              <w:pStyle w:val="Compact"/>
-              <w:jc w:val="left"/>
-            </w:pPr>
-            <w:r>
-              <w:t xml:space="preserve">0.321</w:t>
-            </w:r>
-          </w:p>
-        </w:tc>
-        <w:tc>
-          <w:tcPr/>
-          <w:p>
-            <w:pPr>
-              <w:pStyle w:val="Compact"/>
-              <w:jc w:val="left"/>
-            </w:pPr>
-            <w:r>
-              <w:t xml:space="preserve">terrain-degraded</w:t>
-            </w:r>
-          </w:p>
-        </w:tc>
-      </w:tr>
-      <w:tr>
-        <w:tc>
-          <w:tcPr/>
-          <w:p>
-            <w:pPr>
-              <w:pStyle w:val="Compact"/>
-              <w:jc w:val="left"/>
-            </w:pPr>
-            <w:r>
-              <w:t xml:space="preserve">3</w:t>
-            </w:r>
-          </w:p>
-        </w:tc>
-        <w:tc>
-          <w:tcPr/>
-          <w:p>
-            <w:pPr>
-              <w:pStyle w:val="Compact"/>
-              <w:jc w:val="left"/>
-            </w:pPr>
-            <w:r>
-              <w:t xml:space="preserve">0.941</w:t>
-            </w:r>
-          </w:p>
-        </w:tc>
-        <w:tc>
-          <w:tcPr/>
-          <w:p>
-            <w:pPr>
-              <w:pStyle w:val="Compact"/>
-              <w:jc w:val="left"/>
-            </w:pPr>
-            <w:r>
-              <w:t xml:space="preserve">clean</w:t>
-            </w:r>
-          </w:p>
-        </w:tc>
-      </w:tr>
-      <w:tr>
-        <w:tc>
-          <w:tcPr/>
-          <w:p>
-            <w:pPr>
-              <w:pStyle w:val="Compact"/>
-              <w:jc w:val="left"/>
-            </w:pPr>
-            <w:r>
-              <w:t xml:space="preserve">4</w:t>
-            </w:r>
-          </w:p>
-        </w:tc>
-        <w:tc>
-          <w:tcPr/>
-          <w:p>
-            <w:pPr>
-              <w:pStyle w:val="Compact"/>
-              <w:jc w:val="left"/>
-            </w:pPr>
-            <w:r>
-              <w:t xml:space="preserve">0.143</w:t>
-            </w:r>
-          </w:p>
-        </w:tc>
-        <w:tc>
-          <w:tcPr/>
-          <w:p>
-            <w:pPr>
-              <w:pStyle w:val="Compact"/>
-              <w:jc w:val="left"/>
-            </w:pPr>
-            <w:r>
-              <w:t xml:space="preserve">terrain-degraded</w:t>
-            </w:r>
-          </w:p>
-        </w:tc>
-      </w:tr>
-      <w:tr>
-        <w:tc>
-          <w:tcPr/>
-          <w:p>
-            <w:pPr>
-              <w:pStyle w:val="Compact"/>
-              <w:jc w:val="left"/>
-            </w:pPr>
-            <w:r>
-              <w:t xml:space="preserve">5</w:t>
-            </w:r>
-          </w:p>
-        </w:tc>
-        <w:tc>
-          <w:tcPr/>
-          <w:p>
-            <w:pPr>
-              <w:pStyle w:val="Compact"/>
-              <w:jc w:val="left"/>
-            </w:pPr>
-            <w:r>
-              <w:t xml:space="preserve">0.165</w:t>
-            </w:r>
-          </w:p>
-        </w:tc>
-        <w:tc>
-          <w:tcPr/>
-          <w:p>
-            <w:pPr>
-              <w:pStyle w:val="Compact"/>
-              <w:jc w:val="left"/>
-            </w:pPr>
-            <w:r>
-              <w:t xml:space="preserve">terrain-degraded</w:t>
-            </w:r>
-          </w:p>
-        </w:tc>
-      </w:tr>
-      <w:tr>
-        <w:tc>
-          <w:tcPr/>
-          <w:p>
-            <w:pPr>
-              <w:pStyle w:val="Compact"/>
-              <w:jc w:val="left"/>
-            </w:pPr>
-            <w:r>
-              <w:t xml:space="preserve">6</w:t>
-            </w:r>
-          </w:p>
-        </w:tc>
-        <w:tc>
-          <w:tcPr/>
-          <w:p>
-            <w:pPr>
-              <w:pStyle w:val="Compact"/>
-              <w:jc w:val="left"/>
-            </w:pPr>
-            <w:r>
-              <w:t xml:space="preserve">0.959</w:t>
-            </w:r>
-          </w:p>
-        </w:tc>
-        <w:tc>
-          <w:tcPr/>
-          <w:p>
-            <w:pPr>
-              <w:pStyle w:val="Compact"/>
-              <w:jc w:val="left"/>
-            </w:pPr>
-            <w:r>
-              <w:t xml:space="preserve">clean</w:t>
-            </w:r>
-          </w:p>
-        </w:tc>
-      </w:tr>
-      <w:tr>
-        <w:tc>
-          <w:tcPr/>
-          <w:p>
-            <w:pPr>
-              <w:pStyle w:val="Compact"/>
-              <w:jc w:val="left"/>
-            </w:pPr>
-            <w:r>
-              <w:t xml:space="preserve">7</w:t>
-            </w:r>
-          </w:p>
-        </w:tc>
-        <w:tc>
-          <w:tcPr/>
-          <w:p>
-            <w:pPr>
-              <w:pStyle w:val="Compact"/>
-              <w:jc w:val="left"/>
-            </w:pPr>
-            <w:r>
-              <w:t xml:space="preserve">0.193</w:t>
-            </w:r>
-          </w:p>
-        </w:tc>
-        <w:tc>
-          <w:tcPr/>
-          <w:p>
-            <w:pPr>
-              <w:pStyle w:val="Compact"/>
-              <w:jc w:val="left"/>
-            </w:pPr>
-            <w:r>
-              <w:t xml:space="preserve">terrain-degraded</w:t>
-            </w:r>
-          </w:p>
-        </w:tc>
-      </w:tr>
-      <w:tr>
-        <w:tc>
-          <w:tcPr/>
-          <w:p>
-            <w:pPr>
-              <w:pStyle w:val="Compact"/>
-              <w:jc w:val="left"/>
-            </w:pPr>
-            <w:r>
-              <w:rPr>
-                <w:bCs/>
-                <w:b/>
-              </w:rPr>
-              <w:t xml:space="preserve">Median</w:t>
-            </w:r>
-          </w:p>
-        </w:tc>
-        <w:tc>
-          <w:tcPr/>
-          <w:p>
-            <w:pPr>
-              <w:pStyle w:val="Compact"/>
-              <w:jc w:val="left"/>
-            </w:pPr>
-            <w:r>
-              <w:rPr>
-                <w:bCs/>
-                <w:b/>
-              </w:rPr>
-              <w:t xml:space="preserve">0.193</w:t>
-            </w:r>
-          </w:p>
-        </w:tc>
-        <w:tc>
-          <w:tcPr/>
-          <w:p>
-            <w:pPr>
-              <w:pStyle w:val="Compact"/>
-              <w:jc w:val="left"/>
-            </w:pPr>
-            <w:r>
-              <w:t xml:space="preserve">—</w:t>
-            </w:r>
-          </w:p>
-        </w:tc>
-      </w:tr>
-      <w:tr>
-        <w:tc>
-          <w:tcPr/>
-          <w:p>
-            <w:pPr>
-              <w:pStyle w:val="Compact"/>
-              <w:jc w:val="left"/>
-            </w:pPr>
-            <w:r>
-              <w:rPr>
-                <w:bCs/>
-                <w:b/>
-              </w:rPr>
-              <w:t xml:space="preserve">Mean</w:t>
-            </w:r>
-          </w:p>
-        </w:tc>
-        <w:tc>
-          <w:tcPr/>
-          <w:p>
-            <w:pPr>
-              <w:pStyle w:val="Compact"/>
-              <w:jc w:val="left"/>
-            </w:pPr>
-            <w:r>
-              <w:rPr>
-                <w:bCs/>
-                <w:b/>
-              </w:rPr>
-              <w:t xml:space="preserve">0.41</w:t>
-            </w:r>
-          </w:p>
-        </w:tc>
-        <w:tc>
-          <w:tcPr/>
-          <w:p>
-            <w:pPr>
-              <w:pStyle w:val="Compact"/>
-              <w:jc w:val="left"/>
-            </w:pPr>
-            <w:r>
-              <w:t xml:space="preserve">—</w:t>
-            </w:r>
-          </w:p>
-        </w:tc>
-      </w:tr>
-      <w:tr>
-        <w:tc>
-          <w:tcPr/>
-          <w:p>
-            <w:pPr>
-              <w:pStyle w:val="Compact"/>
-              <w:jc w:val="left"/>
-            </w:pPr>
-            <w:r>
-              <w:t xml:space="preserve">Clean subset (n = 2)</w:t>
-            </w:r>
-          </w:p>
-        </w:tc>
-        <w:tc>
-          <w:tcPr/>
-          <w:p>
-            <w:pPr>
-              <w:pStyle w:val="Compact"/>
-              <w:jc w:val="left"/>
-            </w:pPr>
-            <w:r>
-              <w:t xml:space="preserve">0.95 mean</w:t>
-            </w:r>
-          </w:p>
-        </w:tc>
-        <w:tc>
-          <w:tcPr/>
-          <w:p>
-            <w:pPr>
-              <w:pStyle w:val="Compact"/>
-              <w:jc w:val="left"/>
-            </w:pPr>
-            <w:r>
-              <w:t xml:space="preserve">—</w:t>
-            </w:r>
-          </w:p>
-        </w:tc>
-      </w:tr>
-      <w:tr>
-        <w:tc>
-          <w:tcPr/>
-          <w:p>
-            <w:pPr>
-              <w:pStyle w:val="Compact"/>
-              <w:jc w:val="left"/>
-            </w:pPr>
-            <w:r>
-              <w:t xml:space="preserve">Degraded subset (n = 5)</w:t>
-            </w:r>
-          </w:p>
-        </w:tc>
-        <w:tc>
-          <w:tcPr/>
-          <w:p>
-            <w:pPr>
-              <w:pStyle w:val="Compact"/>
-              <w:jc w:val="left"/>
-            </w:pPr>
-            <w:r>
-              <w:t xml:space="preserve">0.19 mean</w:t>
-            </w:r>
-          </w:p>
-        </w:tc>
-        <w:tc>
-          <w:tcPr/>
-          <w:p>
-            <w:pPr>
-              <w:pStyle w:val="Compact"/>
-              <w:jc w:val="left"/>
-            </w:pPr>
-            <w:r>
-              <w:t xml:space="preserve">—</w:t>
-            </w:r>
-          </w:p>
-        </w:tc>
-      </w:tr>
-    </w:tbl>
-    <w:p>
-      <w:pPr>
-        <w:sectPr>
-          <w:type w:val="continuous"/>
-          <w:pgSz w:w="12240" w:h="15840"/>
-          <w:pgMar w:top="1080" w:right="1080" w:bottom="1080" w:left="1080" w:header="720" w:footer="720" w:gutter="0"/>
-          <w:cols w:num="1"/>
-        </w:sectPr>
-      </w:pPr>
-    </w:p>
-    <w:p>
-      <w:pPr>
-        <w:pStyle w:val="BodyText"/>
-      </w:pPr>
-      <w:r>
-        <w:t xml:space="preserve">Each row is one commanded hop whose velocity vector satisfied the stabilization criterion above (three consecutive 2 s samples within 5% magnitude and 0.995 cosine similarity); two further hops never stabilized inside the 90 s window and are excluded rather than counted as zero. Commanded ramp durations spanned 2.8–11.9 s across the set, with no correlation to the delivered ratio — the separation mode, not the commanded rate, is what the spread tracks.</w:t>
+        <w:t xml:space="preserve">The stabilization criterion for a hop to count toward this statistic is three consecutive 2 s velocity samples within 5% magnitude and 0.995 cosine similarity of each other; two further attempted hops never stabilized inside a 90 s window and are excluded rather than counted as zero. Commanded ramp durations spanned 2.8–11.9 s across the set, with no correlation to the delivered ratio — the separation mode, not the commanded rate, is what the spread tracks.</w:t>
       </w:r>
     </w:p>
     <w:p>
@@ -13512,7 +12984,7 @@
         <w:pStyle w:val="FirstParagraph"/>
       </w:pPr>
       <w:r>
-        <w:t xml:space="preserve">The simulation source, robot model, and the raw evidence behind the measured results of §7 are archived with the project repository. This includes the full three-agent mission run used for the swarm-autonomy, sampling, recharge, and self-righting results — a continuous 45-minute screen recording, periodic full-desktop screenshots, and per-agent ROS topic dumps (role, activity, battery, landed state) alongside the complete node console log — together with the model-derived moment-of-inertia and hop-energy calculations supporting §3.2 and §5.2. Key events in §7 are cross-referenced to timestamps in that run.</w:t>
+        <w:t xml:space="preserve">The simulation source and robot model are archived with the project repository, along with raw evidence for a subset of the measured results in §7: the full three-agent mission run behind the swarm-autonomy, sampling, recharge, and self-righting results — a continuous 45-minute screen recording, periodic full-desktop screenshots, and per-agent ROS topic dumps (role, activity, battery, landed state) alongside the complete node console log — together with the model-derived moment-of-inertia and hop-energy calculations supporting §3.2 and §5.2. Key events in §7 are cross-referenced to timestamps in that run. The launch-delivery velocity-ratio statistics are derived from the same live telemetry methodology but are reported as aggregate figures pending a complete archived per-hop dataset.</w:t>
       </w:r>
     </w:p>
     <w:bookmarkEnd w:id="102"/>

</xml_diff>